<commit_message>
docs: add github link to manual book
</commit_message>
<xml_diff>
--- a/MANUAL_BOOK.docx
+++ b/MANUAL_BOOK.docx
@@ -33,6 +33,11 @@
       </w:pPr>
       <w:r>
         <w:t>Panduan sederhana untuk menjalankan aplikasi di perangkat baru.</w:t>
+      </w:r>
+    </w:p>
+    <w:p>
+      <w:r>
+        <w:t>GitHub Repository: https://github.com/afrizalPrayogi/Reservasi-Lapangan</w:t>
       </w:r>
     </w:p>
     <w:p/>

</xml_diff>